<commit_message>
Paper: document charge-fidelity guard in §4.8 + regenerate exports
Add a charge-fidelity paragraph to §4.8 (md + tex) explaining the guard that
constrains case-analysis endpoints to enumerate only offences actually
charged in the case file — closing the fabricated-charge mode seen in live
validation. Regenerate docx/pdf exports from the updated Markdown.

Co-Authored-By: Claude Opus 4.8 (1M context) <noreply@anthropic.com>
</commit_message>
<xml_diff>
--- a/Testing/research_paper.docx
+++ b/Testing/research_paper.docx
@@ -3103,6 +3103,45 @@
       </w:r>
       <w:r>
         <w:t xml:space="preserve">article number, so it cannot teach the model to emit an ungrounded citation that the evidence validator (Section 4.3) would flag — raising reasoning coverage while preserving the 0 % hallucinated-citation property. Each checklist item is explicitly conditioned on the facts supporting it ("raise a point only when the facts genuinely support it — never invent one"), so the additions trade no precision for their gain in recall.</w:t>
+      </w:r>
+    </w:p>
+    <w:p>
+      <w:pPr>
+        <w:pStyle w:val="BodyText"/>
+      </w:pPr>
+      <w:r>
+        <w:t xml:space="preserve">A companion</w:t>
+      </w:r>
+      <w:r>
+        <w:t xml:space="preserve"> </w:t>
+      </w:r>
+      <w:r>
+        <w:rPr>
+          <w:b/>
+          <w:bCs/>
+        </w:rPr>
+        <w:t xml:space="preserve">charge-fidelity</w:t>
+      </w:r>
+      <w:r>
+        <w:t xml:space="preserve"> </w:t>
+      </w:r>
+      <w:r>
+        <w:t xml:space="preserve">rule extends the same precision principle to the offences themselves: the case-analysis endpoints are constrained to enumerate only offences actually charged or described in the case file, and are explicitly forbidden from inventing an uncharged offence (e.g., adding</w:t>
+      </w:r>
+      <w:r>
+        <w:t xml:space="preserve"> </w:t>
+      </w:r>
+      <w:r>
+        <w:rPr>
+          <w:rStyle w:val="VerbatimChar"/>
+        </w:rPr>
+        <w:t xml:space="preserve">قيادة بدون رخصة</w:t>
+      </w:r>
+      <w:r>
+        <w:t xml:space="preserve"> </w:t>
+      </w:r>
+      <w:r>
+        <w:t xml:space="preserve">when the file never mentions a licence). This closes a fabrication mode observed during live validation, where the generator appended a plausible-but-uncharged offence to an otherwise grounded analysis.</w:t>
       </w:r>
     </w:p>
     <w:p>

</xml_diff>